<commit_message>
Initial voice-to-resume module setup
</commit_message>
<xml_diff>
--- a/generated_resume.docx
+++ b/generated_resume.docx
@@ -22,17 +22,17 @@
     </w:p>
     <w:p>
       <w:r>
-        <w:t>Skills: expectation Python SQL MongoDB</w:t>
+        <w:t>Skills: Python C Java MongoDB</w:t>
       </w:r>
     </w:p>
     <w:p>
       <w:r>
-        <w:t>Experience: what does back end developer and give a Technologies performance in Vandalur</w:t>
+        <w:t>Experience: what does back end developer at key Technologies Vandalur</w:t>
       </w:r>
     </w:p>
     <w:p>
       <w:r>
-        <w:t>Contact: Subhashree 09 2005@gmail.com</w:t>
+        <w:t>Contact: 90801 80526</w:t>
       </w:r>
     </w:p>
     <w:sectPr>

</xml_diff>

<commit_message>
Implemented full voice-based resume builder with spoken questions and long speech capture
</commit_message>
<xml_diff>
--- a/generated_resume.docx
+++ b/generated_resume.docx
@@ -7,32 +7,105 @@
         <w:pStyle w:val="Title"/>
       </w:pPr>
       <w:r>
+        <w:rPr>
+          <w:sz w:val="24"/>
+        </w:rPr>
         <w:t>Resume</w:t>
       </w:r>
     </w:p>
     <w:p>
+      <w:pPr>
+        <w:pStyle w:val="Heading1"/>
+      </w:pPr>
       <w:r>
-        <w:t>Name: Subhashree</w:t>
+        <w:rPr>
+          <w:sz w:val="24"/>
+        </w:rPr>
+        <w:t>What is your name?</w:t>
       </w:r>
     </w:p>
     <w:p>
       <w:r>
-        <w:t>Qualification: BTech 4th year</w:t>
+        <w:rPr>
+          <w:sz w:val="24"/>
+        </w:rPr>
+        <w:t>No response captured</w:t>
+      </w:r>
+    </w:p>
+    <w:p>
+      <w:pPr>
+        <w:pStyle w:val="Heading1"/>
+      </w:pPr>
+      <w:r>
+        <w:rPr>
+          <w:sz w:val="24"/>
+        </w:rPr>
+        <w:t>What is your current qualification?</w:t>
       </w:r>
     </w:p>
     <w:p>
       <w:r>
-        <w:t>Skills: Python C Java MongoDB</w:t>
+        <w:rPr>
+          <w:sz w:val="24"/>
+        </w:rPr>
+        <w:t>BTech 4th year</w:t>
+      </w:r>
+    </w:p>
+    <w:p>
+      <w:pPr>
+        <w:pStyle w:val="Heading1"/>
+      </w:pPr>
+      <w:r>
+        <w:rPr>
+          <w:sz w:val="24"/>
+        </w:rPr>
+        <w:t>What are your technical skills?</w:t>
       </w:r>
     </w:p>
     <w:p>
       <w:r>
-        <w:t>Experience: what does back end developer at key Technologies Vandalur</w:t>
+        <w:rPr>
+          <w:sz w:val="24"/>
+        </w:rPr>
+        <w:t>C Sharp Java</w:t>
+      </w:r>
+    </w:p>
+    <w:p>
+      <w:pPr>
+        <w:pStyle w:val="Heading1"/>
+      </w:pPr>
+      <w:r>
+        <w:rPr>
+          <w:sz w:val="24"/>
+        </w:rPr>
+        <w:t>What projects have you worked on?</w:t>
       </w:r>
     </w:p>
     <w:p>
       <w:r>
-        <w:t>Contact: 90801 80526</w:t>
+        <w:rPr>
+          <w:sz w:val="24"/>
+        </w:rPr>
+        <w:t>resume pass</w:t>
+      </w:r>
+    </w:p>
+    <w:p>
+      <w:pPr>
+        <w:pStyle w:val="Heading1"/>
+      </w:pPr>
+      <w:r>
+        <w:rPr>
+          <w:sz w:val="24"/>
+        </w:rPr>
+        <w:t>What is your career objective?</w:t>
+      </w:r>
+    </w:p>
+    <w:p>
+      <w:r>
+        <w:rPr>
+          <w:sz w:val="24"/>
+        </w:rPr>
+        <w:t>unemployed</w:t>
       </w:r>
     </w:p>
     <w:sectPr>

</xml_diff>